<commit_message>
docs: update 3 docx reports - sync Day 30 drift rates (20-25%), LR values, and migration criteria (lr < 0.5)
</commit_message>
<xml_diff>
--- a/report/Bao_Cao_Ozsu_Valduriez.docx
+++ b/report/Bao_Cao_Ozsu_Valduriez.docx
@@ -2056,7 +2056,9 @@
             <w:tcW w:type="dxa" w:w="2268"/>
           </w:tcPr>
           <w:p>
-            <w:r/>
+            <w:r>
+              <w:t>~20–25%</w:t>
+            </w:r>
             <w:r>
               <w:rPr>
                 <w:rFonts w:ascii="Times New Roman" w:hAnsi="Times New Roman" w:eastAsia="Times New Roman"/>
@@ -2064,7 +2066,6 @@
                 <w:i w:val="0"/>
                 <w:sz w:val="22"/>
               </w:rPr>
-              <w:t>~35–45%</w:t>
             </w:r>
           </w:p>
         </w:tc>
@@ -2073,7 +2074,9 @@
             <w:tcW w:type="dxa" w:w="2268"/>
           </w:tcPr>
           <w:p>
-            <w:r/>
+            <w:r>
+              <w:t>≈ 0.20–0.25</w:t>
+            </w:r>
             <w:r>
               <w:rPr>
                 <w:rFonts w:ascii="Times New Roman" w:hAnsi="Times New Roman" w:eastAsia="Times New Roman"/>
@@ -2081,7 +2084,6 @@
                 <w:i w:val="0"/>
                 <w:sz w:val="22"/>
               </w:rPr>
-              <w:t>≈ 0.35–0.45</w:t>
             </w:r>
           </w:p>
         </w:tc>

</xml_diff>